<commit_message>
Verify Week 3 Azure chatbot with live service
</commit_message>
<xml_diff>
--- a/docs/reports/Azure_AI_Service_Chatbot_Project_Report.docx
+++ b/docs/reports/Azure_AI_Service_Chatbot_Project_Report.docx
@@ -29,7 +29,7 @@
           <w:color w:val="000000"/>
           <w:sz w:val="24"/>
         </w:rPr>
-        <w:t>James Risitne</w:t>
+        <w:t>James Ristine</w:t>
       </w:r>
     </w:p>
     <w:p>
@@ -96,6 +96,7 @@
     <w:p>
       <w:pPr>
         <w:pStyle w:val="Heading1"/>
+        <w:pageBreakBefore w:val="0"/>
       </w:pPr>
       <w:r>
         <w:t>Integrating a Traditional Chatbot with Azure AI Language</w:t>
@@ -143,17 +144,13 @@
           <w:color w:val="000000"/>
           <w:sz w:val="24"/>
         </w:rPr>
-        <w:t>The implementation and automated integration boundary are complete. The verified local run contains nine Azure-specific tests and 26 tests across the repository. The application also constructs successfully with Azure SDK version 5.4.0. At the time this report was prepared, no student-owned Azure endpoint or key had been entered, so I do not claim that a live cloud response occurred. The final required validation is to connect the student's F0 resource and record three non-sensitive sentiment results.</w:t>
-      </w:r>
-    </w:p>
-    <w:p>
-      <w:r>
-        <w:br w:type="page"/>
+        <w:t>The implementation and cloud validation are complete. The verified local run contains nine Azure-specific tests and 26 tests across the repository, and the application constructs successfully with Azure SDK version 5.4.0. I created a student-owned Azure AI Language F0 resource in Canada Central and used it for three live sentiment requests. Only labels and confidence scores were recorded; the access key was not saved in the report, source archive, or Git repository.</w:t>
       </w:r>
     </w:p>
     <w:p>
       <w:pPr>
         <w:pStyle w:val="Heading1"/>
+        <w:pageBreakBefore/>
       </w:pPr>
       <w:r>
         <w:t>Service Selection, Architecture, and Secure Configuration</w:t>
@@ -220,13 +217,9 @@
       </w:r>
     </w:p>
     <w:p>
-      <w:r>
-        <w:br w:type="page"/>
-      </w:r>
-    </w:p>
-    <w:p>
       <w:pPr>
         <w:pStyle w:val="Heading1"/>
+        <w:pageBreakBefore/>
       </w:pPr>
       <w:r>
         <w:t>Implementation and Conversation Flow</w:t>
@@ -293,13 +286,9 @@
       </w:r>
     </w:p>
     <w:p>
-      <w:r>
-        <w:br w:type="page"/>
-      </w:r>
-    </w:p>
-    <w:p>
       <w:pPr>
         <w:pStyle w:val="Heading1"/>
+        <w:pageBreakBefore/>
       </w:pPr>
       <w:r>
         <w:t>Testing, Evaluation, and Current Results</w:t>
@@ -332,7 +321,7 @@
           <w:color w:val="000000"/>
           <w:sz w:val="24"/>
         </w:rPr>
-        <w:t>The verified run completed nine Azure tests and all 26 repository tests. Code quality passed, the Gradio Blocks object constructed, and azure-ai-textanalytics 5.4.0 imported. These results verify the rules, SDK boundary, and local interface. They do not prove that a particular Azure subscription, endpoint, or key is valid.</w:t>
+        <w:t>The verified run completed nine Azure tests and all 26 repository tests. Code quality passed, the Gradio Blocks object constructed, and azure-ai-textanalytics 5.4.0 imported. These results verify the rules, SDK boundary, and local interface. I then completed a separate live acceptance test against the active F0 resource so that the report did not rely on mocked responses alone.</w:t>
       </w:r>
     </w:p>
     <w:p>
@@ -347,7 +336,7 @@
           <w:color w:val="000000"/>
           <w:sz w:val="24"/>
         </w:rPr>
-        <w:t>The live evaluation remains a separate acceptance test. After creating the F0 resource, I will send a positive, negative, and neutral statement. I will record each actual label and three confidence scores in the text-only verification record. An unexpected label should be recorded rather than changed.</w:t>
+        <w:t>The positive statement, 'I am excited that the chatbot is working,' returned Positive with scores of 1.00 positive, 0.00 neutral, and 0.00 negative. The negative statement, 'This setup is frustrating and difficult,' returned Negative with scores of 0.00 positive, 0.00 neutral, and 1.00 negative. The neutral statement, 'The assignment is due this week,' returned Neutral with scores of 0.00 positive, 0.97 neutral, and 0.03 negative. All three labels matched the intended test categories, and the actual values are also recorded in the text-only verification file.</w:t>
       </w:r>
     </w:p>
     <w:p>
@@ -366,13 +355,9 @@
       </w:r>
     </w:p>
     <w:p>
-      <w:r>
-        <w:br w:type="page"/>
-      </w:r>
-    </w:p>
-    <w:p>
       <w:pPr>
         <w:pStyle w:val="Heading1"/>
+        <w:pageBreakBefore/>
       </w:pPr>
       <w:r>
         <w:t>Challenges, Lessons Learned, Improvements, and AI Use Disclosure</w:t>
@@ -390,7 +375,7 @@
           <w:color w:val="000000"/>
           <w:sz w:val="24"/>
         </w:rPr>
-        <w:t>The first challenge was separating code integration from cloud deployment. A fake client makes tests repeatable without transmitting data, but it cannot prove that an Azure resource or its credentials work. I labeled the automated result accurately and kept a separate live-check section. The report does not treat a mock response as Azure usage.</w:t>
+        <w:t>The first challenge was separating code integration from cloud deployment. A fake client makes tests repeatable without transmitting data, but it cannot prove that an Azure resource or its credentials work. I kept those automated checks separate from the live acceptance test, then used the active free-tier resource to verify the real connection. This distinction prevented a mock response from being presented as Azure usage.</w:t>
       </w:r>
     </w:p>
     <w:p>
@@ -435,7 +420,7 @@
           <w:color w:val="000000"/>
           <w:sz w:val="24"/>
         </w:rPr>
-        <w:t>AI use disclosure. I used Codex for initial code scaffolding, test planning, debugging, and editing the report and documentation. Before submission, I will review the requirements, source, citations, tests, and deliverables and will remain responsible for the work. Codex is disclosed as a development tool, not as the report's author or a technical reference.</w:t>
+        <w:t>AI use disclosure. I used Codex for initial code scaffolding, test planning, debugging, and editing the report and documentation. I reviewed the requirements, source, citations, tests, and deliverables and remain responsible for the work. Codex is disclosed as a development tool, not as the report's author or a technical reference.</w:t>
       </w:r>
     </w:p>
     <w:p>
@@ -450,17 +435,13 @@
           <w:color w:val="000000"/>
           <w:sz w:val="24"/>
         </w:rPr>
-        <w:t>AI-as-a-Service involves more than an API call. It needs protected configuration, input limits, error handling, privacy choices, tests, and honest status communication. The project is at https://github.com/Jamesris1/adaptive-ai-course-portfolio. Submission should follow the student-owned Azure resource and live checks.</w:t>
-      </w:r>
-    </w:p>
-    <w:p>
-      <w:r>
-        <w:br w:type="page"/>
+        <w:t>AI-as-a-Service involves more than an API call. It needs protected configuration, input limits, error handling, privacy choices, tests, and honest status communication. The project is at https://github.com/Jamesris1/adaptive-ai-course-portfolio. The student-owned Azure resource and live checks were completed before the submission package was finalized.</w:t>
       </w:r>
     </w:p>
     <w:p>
       <w:pPr>
         <w:pStyle w:val="Heading1"/>
+        <w:pageBreakBefore/>
       </w:pPr>
       <w:r>
         <w:t>References</w:t>

</xml_diff>